<commit_message>
feat: campo de valor reajustado com desconto no contrato
</commit_message>
<xml_diff>
--- a/contrato/modelo-contrato-final.docx
+++ b/contrato/modelo-contrato-final.docx
@@ -236,9 +236,39 @@
           <w:szCs w:val="16"/>
         </w:rPr>
         <w:t>outro lado. Sr(a) : {{ nome_responsavel }}</w:t>
+      </w:r>
+      <w:r>
+        <w:rPr>
+          <w:rFonts w:ascii="Arial" w:hAnsi="Arial" w:cs="Arial"/>
+          <w:sz w:val="16"/>
+          <w:szCs w:val="16"/>
+        </w:rPr>
         <w:tab/>
+      </w:r>
+      <w:r>
+        <w:rPr>
+          <w:rFonts w:ascii="Arial" w:hAnsi="Arial" w:cs="Arial"/>
+          <w:sz w:val="16"/>
+          <w:szCs w:val="16"/>
+        </w:rPr>
         <w:tab/>
-        <w:t xml:space="preserve">                                 doravante denominado COMPRADOR    DATA DE NASCIMENTO {{ nascimento_responsavel }}       </w:t>
+        <w:t xml:space="preserve">                             </w:t>
+      </w:r>
+      <w:r>
+        <w:rPr>
+          <w:rFonts w:ascii="Arial" w:hAnsi="Arial" w:cs="Arial"/>
+          <w:sz w:val="16"/>
+          <w:szCs w:val="16"/>
+        </w:rPr>
+        <w:t xml:space="preserve">  </w:t>
+      </w:r>
+      <w:r>
+        <w:rPr>
+          <w:rFonts w:ascii="Arial" w:hAnsi="Arial" w:cs="Arial"/>
+          <w:sz w:val="16"/>
+          <w:szCs w:val="16"/>
+        </w:rPr>
+        <w:t xml:space="preserve">doravante denominado COMPRADOR    DATA DE NASCIMENTO {{ nascimento_responsavel }}       </w:t>
       </w:r>
       <w:r>
         <w:rPr>
@@ -304,6 +334,13 @@
           <w:szCs w:val="16"/>
         </w:rPr>
         <w:t>Nome do Aluno: {{ nome_aluno }}</w:t>
+      </w:r>
+      <w:r>
+        <w:rPr>
+          <w:rFonts w:ascii="Arial" w:hAnsi="Arial" w:cs="Arial"/>
+          <w:sz w:val="16"/>
+          <w:szCs w:val="16"/>
+        </w:rPr>
         <w:tab/>
         <w:t>DATA DE NASCIMENTO: {{ nascimento_aluno }}</w:t>
       </w:r>
@@ -452,23 +489,6 @@
           <w:szCs w:val="16"/>
         </w:rPr>
         <w:t xml:space="preserve">SP  </w:t>
-      </w:r>
-      <w:r>
-        <w:rPr>
-          <w:rFonts w:ascii="Arial" w:hAnsi="Arial" w:cs="Arial"/>
-          <w:sz w:val="16"/>
-          <w:szCs w:val="16"/>
-        </w:rPr>
-        <w:t>CEP: {{ cep }}</w:t>
-      </w:r>
-      <w:r>
-        <w:rPr>
-          <w:rFonts w:ascii="Arial" w:hAnsi="Arial" w:cs="Arial"/>
-          <w:spacing w:val="57"/>
-          <w:sz w:val="16"/>
-          <w:szCs w:val="16"/>
-        </w:rPr>
-        <w:t xml:space="preserve"> </w:t>
       </w:r>
       <w:r>
         <w:rPr>
@@ -2198,6 +2218,80 @@
           <w:szCs w:val="16"/>
         </w:rPr>
         <w:t>sobre o valor das parcelas verificando-se a data de vencimento das mesmas.</w:t>
+      </w:r>
+      <w:r>
+        <w:rPr>
+          <w:rFonts w:ascii="Arial" w:hAnsi="Arial" w:cs="Arial"/>
+          <w:sz w:val="16"/>
+          <w:szCs w:val="16"/>
+        </w:rPr>
+        <w:t xml:space="preserve"> </w:t>
+      </w:r>
+      <w:r>
+        <w:rPr>
+          <w:rFonts w:ascii="Arial" w:hAnsi="Arial" w:cs="Arial"/>
+          <w:sz w:val="16"/>
+          <w:szCs w:val="16"/>
+        </w:rPr>
+        <w:t>Com isto, o</w:t>
+      </w:r>
+      <w:r>
+        <w:rPr>
+          <w:rFonts w:ascii="Arial" w:hAnsi="Arial" w:cs="Arial"/>
+          <w:sz w:val="16"/>
+          <w:szCs w:val="16"/>
+        </w:rPr>
+        <w:t xml:space="preserve"> </w:t>
+      </w:r>
+      <w:r>
+        <w:rPr>
+          <w:rFonts w:ascii="Arial" w:hAnsi="Arial" w:cs="Arial"/>
+          <w:sz w:val="16"/>
+          <w:szCs w:val="16"/>
+          <w:u w:val="single"/>
+        </w:rPr>
+        <w:t>valor</w:t>
+      </w:r>
+      <w:r>
+        <w:rPr>
+          <w:rFonts w:ascii="Arial" w:hAnsi="Arial" w:cs="Arial"/>
+          <w:sz w:val="16"/>
+          <w:szCs w:val="16"/>
+        </w:rPr>
+        <w:t xml:space="preserve"> reajustado com o desconto é de</w:t>
+      </w:r>
+      <w:r>
+        <w:rPr>
+          <w:rFonts w:ascii="Arial" w:hAnsi="Arial" w:cs="Arial"/>
+          <w:sz w:val="16"/>
+          <w:szCs w:val="16"/>
+        </w:rPr>
+        <w:t xml:space="preserve"> R$</w:t>
+      </w:r>
+      <w:r>
+        <w:rPr>
+          <w:b w:val="0"/>
+          <w:bCs w:val="0"/>
+          <w:sz w:val="22"/>
+          <w:szCs w:val="22"/>
+        </w:rPr>
+        <w:t xml:space="preserve"> </w:t>
+      </w:r>
+      <w:r>
+        <w:rPr>
+          <w:rFonts w:ascii="Arial" w:hAnsi="Arial" w:cs="Arial"/>
+          <w:sz w:val="16"/>
+          <w:szCs w:val="16"/>
+        </w:rPr>
+        <w:t>{{ valor_reajustado }}</w:t>
+      </w:r>
+      <w:r>
+        <w:rPr>
+          <w:rFonts w:ascii="Arial" w:hAnsi="Arial" w:cs="Arial"/>
+          <w:sz w:val="16"/>
+          <w:szCs w:val="16"/>
+        </w:rPr>
+        <w:t xml:space="preserve"> .</w:t>
       </w:r>
     </w:p>
     <w:p>
@@ -2721,6 +2815,13 @@
           <w:szCs w:val="16"/>
         </w:rPr>
         <w:t>Autorizo, de forma gratuita, o uso da imagem, voz e vídeo do(a) aluno(a) para divulgação institucional da escola em redes sociais, site e materiais de comunicação, até eventual revogação por solicitação do responsável.</w:t>
+      </w:r>
+      <w:r>
+        <w:rPr>
+          <w:rFonts w:ascii="Arial" w:hAnsi="Arial" w:cs="Arial"/>
+          <w:sz w:val="16"/>
+          <w:szCs w:val="16"/>
+        </w:rPr>
         <w:tab/>
       </w:r>
       <w:r>
@@ -3299,7 +3400,21 @@
           <w:szCs w:val="18"/>
         </w:rPr>
         <w:t xml:space="preserve">_________________________________               </w:t>
+      </w:r>
+      <w:r>
+        <w:rPr>
+          <w:rFonts w:ascii="Arial" w:eastAsia="Arial" w:hAnsi="Arial" w:cs="Arial"/>
+          <w:sz w:val="18"/>
+          <w:szCs w:val="18"/>
+        </w:rPr>
         <w:tab/>
+      </w:r>
+      <w:r>
+        <w:rPr>
+          <w:rFonts w:ascii="Arial" w:eastAsia="Arial" w:hAnsi="Arial" w:cs="Arial"/>
+          <w:sz w:val="18"/>
+          <w:szCs w:val="18"/>
+        </w:rPr>
         <w:tab/>
         <w:t>___________________________________</w:t>
       </w:r>
@@ -3315,8 +3430,29 @@
           <w:szCs w:val="18"/>
         </w:rPr>
         <w:t xml:space="preserve">         1ª Testemunha                                              </w:t>
+      </w:r>
+      <w:r>
+        <w:rPr>
+          <w:rFonts w:ascii="Arial" w:eastAsia="Arial" w:hAnsi="Arial" w:cs="Arial"/>
+          <w:sz w:val="18"/>
+          <w:szCs w:val="18"/>
+        </w:rPr>
         <w:tab/>
+      </w:r>
+      <w:r>
+        <w:rPr>
+          <w:rFonts w:ascii="Arial" w:eastAsia="Arial" w:hAnsi="Arial" w:cs="Arial"/>
+          <w:sz w:val="18"/>
+          <w:szCs w:val="18"/>
+        </w:rPr>
         <w:tab/>
+      </w:r>
+      <w:r>
+        <w:rPr>
+          <w:rFonts w:ascii="Arial" w:eastAsia="Arial" w:hAnsi="Arial" w:cs="Arial"/>
+          <w:sz w:val="18"/>
+          <w:szCs w:val="18"/>
+        </w:rPr>
         <w:tab/>
         <w:t>Vendedor (a)</w:t>
       </w:r>
@@ -3332,7 +3468,21 @@
           <w:szCs w:val="18"/>
         </w:rPr>
         <w:t xml:space="preserve">_________________________________              </w:t>
+      </w:r>
+      <w:r>
+        <w:rPr>
+          <w:rFonts w:ascii="Arial" w:eastAsia="Arial" w:hAnsi="Arial" w:cs="Arial"/>
+          <w:sz w:val="18"/>
+          <w:szCs w:val="18"/>
+        </w:rPr>
         <w:tab/>
+      </w:r>
+      <w:r>
+        <w:rPr>
+          <w:rFonts w:ascii="Arial" w:eastAsia="Arial" w:hAnsi="Arial" w:cs="Arial"/>
+          <w:sz w:val="18"/>
+          <w:szCs w:val="18"/>
+        </w:rPr>
         <w:tab/>
         <w:t xml:space="preserve"> ___________________________________</w:t>
       </w:r>
@@ -3348,8 +3498,29 @@
           <w:szCs w:val="18"/>
         </w:rPr>
         <w:t xml:space="preserve">         2ª Testemunha                                              </w:t>
+      </w:r>
+      <w:r>
+        <w:rPr>
+          <w:rFonts w:ascii="Arial" w:eastAsia="Arial" w:hAnsi="Arial" w:cs="Arial"/>
+          <w:sz w:val="18"/>
+          <w:szCs w:val="18"/>
+        </w:rPr>
         <w:tab/>
+      </w:r>
+      <w:r>
+        <w:rPr>
+          <w:rFonts w:ascii="Arial" w:eastAsia="Arial" w:hAnsi="Arial" w:cs="Arial"/>
+          <w:sz w:val="18"/>
+          <w:szCs w:val="18"/>
+        </w:rPr>
         <w:tab/>
+      </w:r>
+      <w:r>
+        <w:rPr>
+          <w:rFonts w:ascii="Arial" w:eastAsia="Arial" w:hAnsi="Arial" w:cs="Arial"/>
+          <w:sz w:val="18"/>
+          <w:szCs w:val="18"/>
+        </w:rPr>
         <w:tab/>
         <w:t>Comprador</w:t>
       </w:r>
@@ -3365,14 +3536,77 @@
           <w:szCs w:val="18"/>
         </w:rPr>
         <w:tab/>
+      </w:r>
+      <w:r>
+        <w:rPr>
+          <w:rFonts w:ascii="Arial" w:eastAsia="Arial" w:hAnsi="Arial" w:cs="Arial"/>
+          <w:sz w:val="18"/>
+          <w:szCs w:val="18"/>
+        </w:rPr>
         <w:tab/>
+      </w:r>
+      <w:r>
+        <w:rPr>
+          <w:rFonts w:ascii="Arial" w:eastAsia="Arial" w:hAnsi="Arial" w:cs="Arial"/>
+          <w:sz w:val="18"/>
+          <w:szCs w:val="18"/>
+        </w:rPr>
         <w:tab/>
+      </w:r>
+      <w:r>
+        <w:rPr>
+          <w:rFonts w:ascii="Arial" w:eastAsia="Arial" w:hAnsi="Arial" w:cs="Arial"/>
+          <w:sz w:val="18"/>
+          <w:szCs w:val="18"/>
+        </w:rPr>
         <w:tab/>
+      </w:r>
+      <w:r>
+        <w:rPr>
+          <w:rFonts w:ascii="Arial" w:eastAsia="Arial" w:hAnsi="Arial" w:cs="Arial"/>
+          <w:sz w:val="18"/>
+          <w:szCs w:val="18"/>
+        </w:rPr>
         <w:tab/>
+      </w:r>
+      <w:r>
+        <w:rPr>
+          <w:rFonts w:ascii="Arial" w:eastAsia="Arial" w:hAnsi="Arial" w:cs="Arial"/>
+          <w:sz w:val="18"/>
+          <w:szCs w:val="18"/>
+        </w:rPr>
         <w:tab/>
+      </w:r>
+      <w:r>
+        <w:rPr>
+          <w:rFonts w:ascii="Arial" w:eastAsia="Arial" w:hAnsi="Arial" w:cs="Arial"/>
+          <w:sz w:val="18"/>
+          <w:szCs w:val="18"/>
+        </w:rPr>
         <w:tab/>
+      </w:r>
+      <w:r>
+        <w:rPr>
+          <w:rFonts w:ascii="Arial" w:eastAsia="Arial" w:hAnsi="Arial" w:cs="Arial"/>
+          <w:sz w:val="18"/>
+          <w:szCs w:val="18"/>
+        </w:rPr>
         <w:tab/>
+      </w:r>
+      <w:r>
+        <w:rPr>
+          <w:rFonts w:ascii="Arial" w:eastAsia="Arial" w:hAnsi="Arial" w:cs="Arial"/>
+          <w:sz w:val="18"/>
+          <w:szCs w:val="18"/>
+        </w:rPr>
         <w:tab/>
+      </w:r>
+      <w:r>
+        <w:rPr>
+          <w:rFonts w:ascii="Arial" w:eastAsia="Arial" w:hAnsi="Arial" w:cs="Arial"/>
+          <w:sz w:val="18"/>
+          <w:szCs w:val="18"/>
+        </w:rPr>
         <w:tab/>
         <w:t>_____________________________</w:t>
       </w:r>
@@ -3403,7 +3637,7 @@
           <w:sz w:val="18"/>
           <w:szCs w:val="18"/>
         </w:rPr>
-        <w:t xml:space="preserve">DIAS: {{ dias_aula }} | HORÁRIO: {{ horario_aula }}</w:t>
+        <w:t>DIAS: {{ dias_aula }} | HORÁRIO: {{ horario_aula }}</w:t>
       </w:r>
       <w:r>
         <w:rPr>
@@ -4271,7 +4505,6 @@
   <w:style w:type="character" w:default="1" w:styleId="Fontepargpadro">
     <w:name w:val="Default Paragraph Font"/>
     <w:uiPriority w:val="1"/>
-    <w:semiHidden/>
     <w:unhideWhenUsed/>
   </w:style>
   <w:style w:type="table" w:default="1" w:styleId="Tabelanormal">

</xml_diff>